<commit_message>
Update offer letter for 西川弛隼 to match registered job posting (start 2027/4/1, fixed overtime 30h)
Co-Authored-By: Claude Opus 5.5 <noreply@anthropic.com>
Claude-Session: https://claude.ai/code/session_01MrxaxUjGprDpGd4ocCM8GD
</commit_message>
<xml_diff>
--- a/内定書類_西川弛隼様/内定承諾書_西川弛隼様.docx
+++ b/内定書類_西川弛隼様/内定承諾書_西川弛隼様.docx
@@ -1,18 +1,20 @@
 
 <file path=word/document.xml><?xml version="1.0" encoding="utf-8"?>
-<w:document xmlns:wpc="http://schemas.microsoft.com/office/word/2010/wordprocessingCanvas" xmlns:cx="http://schemas.microsoft.com/office/drawing/2014/chartex" xmlns:cx1="http://schemas.microsoft.com/office/drawing/2015/9/8/chartex" xmlns:cx2="http://schemas.microsoft.com/office/drawing/2015/10/21/chartex" xmlns:cx3="http://schemas.microsoft.com/office/drawing/2016/5/9/chartex" xmlns:cx4="http://schemas.microsoft.com/office/drawing/2016/5/10/chartex" xmlns:cx5="http://schemas.microsoft.com/office/drawing/2016/5/11/chartex" xmlns:cx6="http://schemas.microsoft.com/office/drawing/2016/5/12/chartex" xmlns:cx7="http://schemas.microsoft.com/office/drawing/2016/5/13/chartex" xmlns:cx8="http://schemas.microsoft.com/office/drawing/2016/5/14/chartex" xmlns:mc="http://schemas.openxmlformats.org/markup-compatibility/2006" xmlns:aink="http://schemas.microsoft.com/office/drawing/2016/ink" xmlns:am3d="http://schemas.microsoft.com/office/drawing/2017/model3d" xmlns:o="urn:schemas-microsoft-com:office:office" xmlns:oel="http://schemas.microsoft.com/office/2019/extlst" xmlns:r="http://schemas.openxmlformats.org/officeDocument/2006/relationships" xmlns:m="http://schemas.openxmlformats.org/officeDocument/2006/math" xmlns:v="urn:schemas-microsoft-com:vml" xmlns:wp14="http://schemas.microsoft.com/office/word/2010/wordprocessingDrawing" xmlns:wp="http://schemas.openxmlformats.org/drawingml/2006/wordprocessingDrawing" xmlns:w10="urn:schemas-microsoft-com:office:word" xmlns:w="http://schemas.openxmlformats.org/wordprocessingml/2006/main" xmlns:w14="http://schemas.microsoft.com/office/word/2010/wordml" xmlns:w15="http://schemas.microsoft.com/office/word/2012/wordml" xmlns:w16cex="http://schemas.microsoft.com/office/word/2018/wordml/cex" xmlns:w16cid="http://schemas.microsoft.com/office/word/2016/wordml/cid" xmlns:w16="http://schemas.microsoft.com/office/word/2018/wordml" xmlns:w16sdtdh="http://schemas.microsoft.com/office/word/2020/wordml/sdtdatahash" xmlns:w16se="http://schemas.microsoft.com/office/word/2015/wordml/symex" xmlns:wpg="http://schemas.microsoft.com/office/word/2010/wordprocessingGroup" xmlns:wpi="http://schemas.microsoft.com/office/word/2010/wordprocessingInk" xmlns:wne="http://schemas.microsoft.com/office/word/2006/wordml" xmlns:wps="http://schemas.microsoft.com/office/word/2010/wordprocessingShape" mc:Ignorable="w14 w15 w16se w16cid w16 w16cex w16sdtdh wp14">
+<w:document xmlns:wpc="http://schemas.microsoft.com/office/word/2010/wordprocessingCanvas" xmlns:cx="http://schemas.microsoft.com/office/drawing/2014/chartex" xmlns:cx1="http://schemas.microsoft.com/office/drawing/2015/9/8/chartex" xmlns:cx2="http://schemas.microsoft.com/office/drawing/2015/10/21/chartex" xmlns:cx3="http://schemas.microsoft.com/office/drawing/2016/5/9/chartex" xmlns:cx4="http://schemas.microsoft.com/office/drawing/2016/5/10/chartex" xmlns:cx5="http://schemas.microsoft.com/office/drawing/2016/5/11/chartex" xmlns:cx6="http://schemas.microsoft.com/office/drawing/2016/5/12/chartex" xmlns:cx7="http://schemas.microsoft.com/office/drawing/2016/5/13/chartex" xmlns:cx8="http://schemas.microsoft.com/office/drawing/2016/5/14/chartex" xmlns:mc="http://schemas.openxmlformats.org/markup-compatibility/2006" xmlns:aink="http://schemas.microsoft.com/office/drawing/2016/ink" xmlns:am3d="http://schemas.microsoft.com/office/drawing/2017/model3d" xmlns:o="urn:schemas-microsoft-com:office:office" xmlns:oel="http://schemas.microsoft.com/office/2019/extlst" xmlns:r="http://schemas.openxmlformats.org/officeDocument/2006/relationships" xmlns:m="http://schemas.openxmlformats.org/officeDocument/2006/math" xmlns:v="urn:schemas-microsoft-com:vml" xmlns:wp14="http://schemas.microsoft.com/office/word/2010/wordprocessingDrawing" xmlns:wp="http://schemas.openxmlformats.org/drawingml/2006/wordprocessingDrawing" xmlns:w10="urn:schemas-microsoft-com:office:word" xmlns:w="http://schemas.openxmlformats.org/wordprocessingml/2006/main" xmlns:w14="http://schemas.microsoft.com/office/word/2010/wordml" xmlns:w15="http://schemas.microsoft.com/office/word/2012/wordml" xmlns:w16cex="http://schemas.microsoft.com/office/word/2018/wordml/cex" xmlns:w16cid="http://schemas.microsoft.com/office/word/2016/wordml/cid" xmlns:w16="http://schemas.microsoft.com/office/word/2018/wordml" xmlns:w16du="http://schemas.microsoft.com/office/word/2023/wordml/word16du" xmlns:w16sdtdh="http://schemas.microsoft.com/office/word/2020/wordml/sdtdatahash" xmlns:w16sdtfl="http://schemas.microsoft.com/office/word/2024/wordml/sdtformatlock" xmlns:w16se="http://schemas.microsoft.com/office/word/2015/wordml/symex" xmlns:wpg="http://schemas.microsoft.com/office/word/2010/wordprocessingGroup" xmlns:wpi="http://schemas.microsoft.com/office/word/2010/wordprocessingInk" xmlns:wne="http://schemas.microsoft.com/office/word/2006/wordml" xmlns:wps="http://schemas.microsoft.com/office/word/2010/wordprocessingShape" mc:Ignorable="w14 w15 w16se w16cid w16 w16cex w16sdtdh w16sdtfl w16du wp14">
   <w:body>
     <w:p>
       <w:pPr>
         <w:rPr>
           <w:rFonts w:ascii="HG正楷書体-PRO" w:eastAsia="HG正楷書体-PRO"/>
           <w:sz w:val="22"/>
-        </w:rPr>
-      </w:pPr>
-      <w:r>
-        <w:rPr>
-          <w:rFonts w:ascii="HG正楷書体-PRO" w:eastAsia="HG正楷書体-PRO" w:hint="eastAsia"/>
-          <w:sz w:val="22"/>
+          <w:lang w:eastAsia="zh-TW"/>
+        </w:rPr>
+      </w:pPr>
+      <w:r>
+        <w:rPr>
+          <w:rFonts w:ascii="HG正楷書体-PRO" w:eastAsia="HG正楷書体-PRO" w:hint="eastAsia"/>
+          <w:sz w:val="22"/>
+          <w:lang w:eastAsia="zh-TW"/>
         </w:rPr>
         <w:t>御園建設株式会社</w:t>
       </w:r>
@@ -22,12 +24,14 @@
         <w:rPr>
           <w:rFonts w:ascii="HG正楷書体-PRO" w:eastAsia="HG正楷書体-PRO"/>
           <w:sz w:val="22"/>
-        </w:rPr>
-      </w:pPr>
-      <w:r>
-        <w:rPr>
-          <w:rFonts w:ascii="HG正楷書体-PRO" w:eastAsia="HG正楷書体-PRO" w:hint="eastAsia"/>
-          <w:sz w:val="22"/>
+          <w:lang w:eastAsia="zh-TW"/>
+        </w:rPr>
+      </w:pPr>
+      <w:r>
+        <w:rPr>
+          <w:rFonts w:ascii="HG正楷書体-PRO" w:eastAsia="HG正楷書体-PRO" w:hint="eastAsia"/>
+          <w:sz w:val="22"/>
+          <w:lang w:eastAsia="zh-TW"/>
         </w:rPr>
         <w:t>代表取締役社長</w:t>
       </w:r>
@@ -37,12 +41,14 @@
         <w:rPr>
           <w:rFonts w:ascii="HG正楷書体-PRO" w:eastAsia="HG正楷書体-PRO"/>
           <w:sz w:val="22"/>
-        </w:rPr>
-      </w:pPr>
-      <w:r>
-        <w:rPr>
-          <w:rFonts w:ascii="HG正楷書体-PRO" w:eastAsia="HG正楷書体-PRO" w:hint="eastAsia"/>
-          <w:sz w:val="22"/>
+          <w:lang w:eastAsia="zh-TW"/>
+        </w:rPr>
+      </w:pPr>
+      <w:r>
+        <w:rPr>
+          <w:rFonts w:ascii="HG正楷書体-PRO" w:eastAsia="HG正楷書体-PRO" w:hint="eastAsia"/>
+          <w:sz w:val="22"/>
+          <w:lang w:eastAsia="zh-TW"/>
         </w:rPr>
         <w:t xml:space="preserve">　　秋葉幸男　殿</w:t>
       </w:r>
@@ -52,14 +58,16 @@
         <w:rPr>
           <w:rFonts w:ascii="HG正楷書体-PRO" w:eastAsia="HG正楷書体-PRO"/>
           <w:sz w:val="22"/>
-        </w:rPr>
-      </w:pPr>
-    </w:p>
-    <w:p>
-      <w:pPr>
-        <w:rPr>
-          <w:rFonts w:ascii="HG正楷書体-PRO" w:eastAsia="HG正楷書体-PRO"/>
-          <w:sz w:val="22"/>
+          <w:lang w:eastAsia="zh-TW"/>
+        </w:rPr>
+      </w:pPr>
+    </w:p>
+    <w:p>
+      <w:pPr>
+        <w:rPr>
+          <w:rFonts w:ascii="HG正楷書体-PRO" w:eastAsia="HG正楷書体-PRO"/>
+          <w:sz w:val="22"/>
+          <w:lang w:eastAsia="zh-TW"/>
         </w:rPr>
       </w:pPr>
     </w:p>
@@ -69,12 +77,14 @@
         <w:rPr>
           <w:rFonts w:ascii="HG正楷書体-PRO" w:eastAsia="HG正楷書体-PRO"/>
           <w:sz w:val="24"/>
+          <w:lang w:eastAsia="zh-TW"/>
         </w:rPr>
       </w:pPr>
       <w:r>
         <w:rPr>
           <w:rFonts w:ascii="HG正楷書体-PRO" w:eastAsia="HG正楷書体-PRO" w:hint="eastAsia"/>
           <w:sz w:val="24"/>
+          <w:lang w:eastAsia="zh-TW"/>
         </w:rPr>
         <w:t>内定承諾書</w:t>
       </w:r>
@@ -84,14 +94,16 @@
         <w:rPr>
           <w:rFonts w:ascii="HG正楷書体-PRO" w:eastAsia="HG正楷書体-PRO"/>
           <w:sz w:val="22"/>
-        </w:rPr>
-      </w:pPr>
-    </w:p>
-    <w:p>
-      <w:pPr>
-        <w:rPr>
-          <w:rFonts w:ascii="HG正楷書体-PRO" w:eastAsia="HG正楷書体-PRO"/>
-          <w:sz w:val="22"/>
+          <w:lang w:eastAsia="zh-TW"/>
+        </w:rPr>
+      </w:pPr>
+    </w:p>
+    <w:p>
+      <w:pPr>
+        <w:rPr>
+          <w:rFonts w:ascii="HG正楷書体-PRO" w:eastAsia="HG正楷書体-PRO"/>
+          <w:sz w:val="22"/>
+          <w:lang w:eastAsia="zh-TW"/>
         </w:rPr>
       </w:pPr>
     </w:p>
@@ -262,7 +274,7 @@
     <w:p>
       <w:pPr>
         <w:rPr>
-          <w:rFonts w:ascii="HG正楷書体-PRO" w:eastAsia="HG正楷書体-PRO"/>
+          <w:rFonts w:ascii="HG正楷書体-PRO" w:eastAsia="HG正楷書体-PRO" w:hint="eastAsia"/>
           <w:sz w:val="22"/>
         </w:rPr>
       </w:pPr>
@@ -276,24 +288,18 @@
     </w:p>
     <w:p>
       <w:pPr>
-        <w:rPr>
-          <w:rFonts w:ascii="HG正楷書体-PRO" w:eastAsia="HG正楷書体-PRO"/>
-          <w:sz w:val="22"/>
-        </w:rPr>
-      </w:pPr>
-    </w:p>
-    <w:p>
-      <w:pPr>
         <w:jc w:val="right"/>
         <w:rPr>
           <w:rFonts w:ascii="HG正楷書体-PRO" w:eastAsia="HG正楷書体-PRO"/>
           <w:sz w:val="22"/>
-        </w:rPr>
-      </w:pPr>
-      <w:r>
-        <w:rPr>
-          <w:rFonts w:ascii="HG正楷書体-PRO" w:eastAsia="HG正楷書体-PRO" w:hint="eastAsia"/>
-          <w:sz w:val="22"/>
+          <w:lang w:eastAsia="zh-TW"/>
+        </w:rPr>
+      </w:pPr>
+      <w:r>
+        <w:rPr>
+          <w:rFonts w:ascii="HG正楷書体-PRO" w:eastAsia="HG正楷書体-PRO" w:hint="eastAsia"/>
+          <w:sz w:val="22"/>
+          <w:lang w:eastAsia="zh-TW"/>
         </w:rPr>
         <w:t>本人</w:t>
       </w:r>
@@ -304,12 +310,14 @@
         <w:rPr>
           <w:rFonts w:ascii="HG正楷書体-PRO" w:eastAsia="HG正楷書体-PRO"/>
           <w:sz w:val="22"/>
-        </w:rPr>
-      </w:pPr>
-      <w:r>
-        <w:rPr>
-          <w:rFonts w:ascii="HG正楷書体-PRO" w:eastAsia="HG正楷書体-PRO" w:hint="eastAsia"/>
-          <w:sz w:val="22"/>
+          <w:lang w:eastAsia="zh-TW"/>
+        </w:rPr>
+      </w:pPr>
+      <w:r>
+        <w:rPr>
+          <w:rFonts w:ascii="HG正楷書体-PRO" w:eastAsia="HG正楷書体-PRO" w:hint="eastAsia"/>
+          <w:sz w:val="22"/>
+          <w:lang w:eastAsia="zh-TW"/>
         </w:rPr>
         <w:t>現住所</w:t>
       </w:r>
@@ -322,6 +330,7 @@
           <w:rFonts w:ascii="HG正楷書体-PRO" w:eastAsia="HG正楷書体-PRO"/>
           <w:sz w:val="22"/>
           <w:u w:val="single"/>
+          <w:lang w:eastAsia="zh-TW"/>
         </w:rPr>
       </w:pPr>
     </w:p>
@@ -333,6 +342,7 @@
           <w:rFonts w:ascii="HG正楷書体-PRO" w:eastAsia="HG正楷書体-PRO"/>
           <w:sz w:val="22"/>
           <w:u w:val="single"/>
+          <w:lang w:eastAsia="zh-TW"/>
         </w:rPr>
       </w:pPr>
       <w:r>
@@ -340,6 +350,7 @@
           <w:rFonts w:ascii="HG正楷書体-PRO" w:eastAsia="HG正楷書体-PRO" w:hint="eastAsia"/>
           <w:sz w:val="22"/>
           <w:u w:val="single"/>
+          <w:lang w:eastAsia="zh-TW"/>
         </w:rPr>
         <w:t xml:space="preserve">　　　　　　　　　　　　　　　　　　　　　　</w:t>
       </w:r>
@@ -350,12 +361,14 @@
         <w:rPr>
           <w:rFonts w:ascii="HG正楷書体-PRO" w:eastAsia="HG正楷書体-PRO"/>
           <w:sz w:val="22"/>
-        </w:rPr>
-      </w:pPr>
-      <w:r>
-        <w:rPr>
-          <w:rFonts w:ascii="HG正楷書体-PRO" w:eastAsia="HG正楷書体-PRO" w:hint="eastAsia"/>
-          <w:sz w:val="22"/>
+          <w:lang w:eastAsia="zh-TW"/>
+        </w:rPr>
+      </w:pPr>
+      <w:r>
+        <w:rPr>
+          <w:rFonts w:ascii="HG正楷書体-PRO" w:eastAsia="HG正楷書体-PRO" w:hint="eastAsia"/>
+          <w:sz w:val="22"/>
+          <w:lang w:eastAsia="zh-TW"/>
         </w:rPr>
         <w:t>氏名</w:t>
       </w:r>
@@ -368,12 +381,14 @@
           <w:rFonts w:ascii="HG正楷書体-PRO" w:eastAsia="HG正楷書体-PRO"/>
           <w:sz w:val="22"/>
           <w:u w:val="single"/>
-        </w:rPr>
-      </w:pPr>
-      <w:r>
-        <w:rPr>
-          <w:rFonts w:ascii="HG正楷書体-PRO" w:eastAsia="HG正楷書体-PRO" w:hint="eastAsia"/>
-          <w:sz w:val="22"/>
+          <w:lang w:eastAsia="zh-TW"/>
+        </w:rPr>
+      </w:pPr>
+      <w:r>
+        <w:rPr>
+          <w:rFonts w:ascii="HG正楷書体-PRO" w:eastAsia="HG正楷書体-PRO" w:hint="eastAsia"/>
+          <w:sz w:val="22"/>
+          <w:lang w:eastAsia="zh-TW"/>
         </w:rPr>
         <w:t xml:space="preserve">　　</w:t>
       </w:r>
@@ -382,6 +397,7 @@
           <w:rFonts w:ascii="HG正楷書体-PRO" w:eastAsia="HG正楷書体-PRO" w:hint="eastAsia"/>
           <w:sz w:val="22"/>
           <w:u w:val="single"/>
+          <w:lang w:eastAsia="zh-TW"/>
         </w:rPr>
         <w:t xml:space="preserve">　　　　　　　　　　　　　　　　　　　　　印</w:t>
       </w:r>
@@ -392,6 +408,7 @@
         <w:rPr>
           <w:rFonts w:ascii="HG正楷書体-PRO" w:eastAsia="HG正楷書体-PRO"/>
           <w:sz w:val="22"/>
+          <w:lang w:eastAsia="zh-TW"/>
         </w:rPr>
       </w:pPr>
     </w:p>
@@ -401,12 +418,14 @@
         <w:rPr>
           <w:rFonts w:ascii="HG正楷書体-PRO" w:eastAsia="HG正楷書体-PRO"/>
           <w:sz w:val="22"/>
-        </w:rPr>
-      </w:pPr>
-      <w:r>
-        <w:rPr>
-          <w:rFonts w:ascii="HG正楷書体-PRO" w:eastAsia="HG正楷書体-PRO" w:hint="eastAsia"/>
-          <w:sz w:val="22"/>
+          <w:lang w:eastAsia="zh-TW"/>
+        </w:rPr>
+      </w:pPr>
+      <w:r>
+        <w:rPr>
+          <w:rFonts w:ascii="HG正楷書体-PRO" w:eastAsia="HG正楷書体-PRO" w:hint="eastAsia"/>
+          <w:sz w:val="22"/>
+          <w:lang w:eastAsia="zh-TW"/>
         </w:rPr>
         <w:t>保証人</w:t>
       </w:r>
@@ -417,12 +436,14 @@
         <w:rPr>
           <w:rFonts w:ascii="HG正楷書体-PRO" w:eastAsia="HG正楷書体-PRO"/>
           <w:sz w:val="22"/>
-        </w:rPr>
-      </w:pPr>
-      <w:r>
-        <w:rPr>
-          <w:rFonts w:ascii="HG正楷書体-PRO" w:eastAsia="HG正楷書体-PRO" w:hint="eastAsia"/>
-          <w:sz w:val="22"/>
+          <w:lang w:eastAsia="zh-TW"/>
+        </w:rPr>
+      </w:pPr>
+      <w:r>
+        <w:rPr>
+          <w:rFonts w:ascii="HG正楷書体-PRO" w:eastAsia="HG正楷書体-PRO" w:hint="eastAsia"/>
+          <w:sz w:val="22"/>
+          <w:lang w:eastAsia="zh-TW"/>
         </w:rPr>
         <w:t>現住所</w:t>
       </w:r>
@@ -435,6 +456,7 @@
           <w:rFonts w:ascii="HG正楷書体-PRO" w:eastAsia="HG正楷書体-PRO"/>
           <w:sz w:val="22"/>
           <w:u w:val="single"/>
+          <w:lang w:eastAsia="zh-TW"/>
         </w:rPr>
       </w:pPr>
     </w:p>
@@ -446,6 +468,7 @@
           <w:rFonts w:ascii="HG正楷書体-PRO" w:eastAsia="HG正楷書体-PRO"/>
           <w:sz w:val="22"/>
           <w:u w:val="single"/>
+          <w:lang w:eastAsia="zh-TW"/>
         </w:rPr>
       </w:pPr>
       <w:r>
@@ -453,6 +476,7 @@
           <w:rFonts w:ascii="HG正楷書体-PRO" w:eastAsia="HG正楷書体-PRO" w:hint="eastAsia"/>
           <w:sz w:val="22"/>
           <w:u w:val="single"/>
+          <w:lang w:eastAsia="zh-TW"/>
         </w:rPr>
         <w:t xml:space="preserve">　　　　　　　　　　　　　　　　　　　　　　</w:t>
       </w:r>
@@ -463,12 +487,14 @@
         <w:rPr>
           <w:rFonts w:ascii="HG正楷書体-PRO" w:eastAsia="HG正楷書体-PRO"/>
           <w:sz w:val="22"/>
-        </w:rPr>
-      </w:pPr>
-      <w:r>
-        <w:rPr>
-          <w:rFonts w:ascii="HG正楷書体-PRO" w:eastAsia="HG正楷書体-PRO" w:hint="eastAsia"/>
-          <w:sz w:val="22"/>
+          <w:lang w:eastAsia="zh-TW"/>
+        </w:rPr>
+      </w:pPr>
+      <w:r>
+        <w:rPr>
+          <w:rFonts w:ascii="HG正楷書体-PRO" w:eastAsia="HG正楷書体-PRO" w:hint="eastAsia"/>
+          <w:sz w:val="22"/>
+          <w:lang w:eastAsia="zh-TW"/>
         </w:rPr>
         <w:t>氏名</w:t>
       </w:r>
@@ -485,8 +511,17 @@
           <w:rFonts w:ascii="HG正楷書体-PRO" w:eastAsia="HG正楷書体-PRO"/>
           <w:sz w:val="22"/>
           <w:u w:val="single"/>
-        </w:rPr>
-        <w:t xml:space="preserve">　　　　　　　　　　　　　　　　　　　　　　　印</w:t>
+          <w:lang w:eastAsia="zh-TW"/>
+        </w:rPr>
+        <w:t xml:space="preserve">　　　　　　　　　　　　　　　　　　　　　　　</w:t>
+      </w:r>
+      <w:r>
+        <w:rPr>
+          <w:rFonts w:ascii="HG正楷書体-PRO" w:eastAsia="HG正楷書体-PRO"/>
+          <w:sz w:val="22"/>
+          <w:u w:val="single"/>
+        </w:rPr>
+        <w:t>印</w:t>
       </w:r>
     </w:p>
     <w:p>
@@ -500,7 +535,6 @@
         <w:rPr>
           <w:rFonts w:ascii="HG正楷書体-PRO" w:eastAsia="HG正楷書体-PRO" w:hint="eastAsia"/>
         </w:rPr>
-        <w:lastRenderedPageBreak/>
         <w:t>以上</w:t>
       </w:r>
     </w:p>
@@ -515,7 +549,7 @@
 </file>
 
 <file path=word/numbering.xml><?xml version="1.0" encoding="utf-8"?>
-<w:numbering xmlns:wpc="http://schemas.microsoft.com/office/word/2010/wordprocessingCanvas" xmlns:cx="http://schemas.microsoft.com/office/drawing/2014/chartex" xmlns:cx1="http://schemas.microsoft.com/office/drawing/2015/9/8/chartex" xmlns:cx2="http://schemas.microsoft.com/office/drawing/2015/10/21/chartex" xmlns:cx3="http://schemas.microsoft.com/office/drawing/2016/5/9/chartex" xmlns:cx4="http://schemas.microsoft.com/office/drawing/2016/5/10/chartex" xmlns:cx5="http://schemas.microsoft.com/office/drawing/2016/5/11/chartex" xmlns:cx6="http://schemas.microsoft.com/office/drawing/2016/5/12/chartex" xmlns:cx7="http://schemas.microsoft.com/office/drawing/2016/5/13/chartex" xmlns:cx8="http://schemas.microsoft.com/office/drawing/2016/5/14/chartex" xmlns:mc="http://schemas.openxmlformats.org/markup-compatibility/2006" xmlns:aink="http://schemas.microsoft.com/office/drawing/2016/ink" xmlns:am3d="http://schemas.microsoft.com/office/drawing/2017/model3d" xmlns:o="urn:schemas-microsoft-com:office:office" xmlns:oel="http://schemas.microsoft.com/office/2019/extlst" xmlns:r="http://schemas.openxmlformats.org/officeDocument/2006/relationships" xmlns:m="http://schemas.openxmlformats.org/officeDocument/2006/math" xmlns:v="urn:schemas-microsoft-com:vml" xmlns:wp14="http://schemas.microsoft.com/office/word/2010/wordprocessingDrawing" xmlns:wp="http://schemas.openxmlformats.org/drawingml/2006/wordprocessingDrawing" xmlns:w10="urn:schemas-microsoft-com:office:word" xmlns:w="http://schemas.openxmlformats.org/wordprocessingml/2006/main" xmlns:w14="http://schemas.microsoft.com/office/word/2010/wordml" xmlns:w15="http://schemas.microsoft.com/office/word/2012/wordml" xmlns:w16cex="http://schemas.microsoft.com/office/word/2018/wordml/cex" xmlns:w16cid="http://schemas.microsoft.com/office/word/2016/wordml/cid" xmlns:w16="http://schemas.microsoft.com/office/word/2018/wordml" xmlns:w16sdtdh="http://schemas.microsoft.com/office/word/2020/wordml/sdtdatahash" xmlns:w16se="http://schemas.microsoft.com/office/word/2015/wordml/symex" xmlns:wpg="http://schemas.microsoft.com/office/word/2010/wordprocessingGroup" xmlns:wpi="http://schemas.microsoft.com/office/word/2010/wordprocessingInk" xmlns:wne="http://schemas.microsoft.com/office/word/2006/wordml" xmlns:wps="http://schemas.microsoft.com/office/word/2010/wordprocessingShape" mc:Ignorable="w14 w15 w16se w16cid w16 w16cex w16sdtdh wp14">
+<w:numbering xmlns:wpc="http://schemas.microsoft.com/office/word/2010/wordprocessingCanvas" xmlns:cx="http://schemas.microsoft.com/office/drawing/2014/chartex" xmlns:cx1="http://schemas.microsoft.com/office/drawing/2015/9/8/chartex" xmlns:cx2="http://schemas.microsoft.com/office/drawing/2015/10/21/chartex" xmlns:cx3="http://schemas.microsoft.com/office/drawing/2016/5/9/chartex" xmlns:cx4="http://schemas.microsoft.com/office/drawing/2016/5/10/chartex" xmlns:cx5="http://schemas.microsoft.com/office/drawing/2016/5/11/chartex" xmlns:cx6="http://schemas.microsoft.com/office/drawing/2016/5/12/chartex" xmlns:cx7="http://schemas.microsoft.com/office/drawing/2016/5/13/chartex" xmlns:cx8="http://schemas.microsoft.com/office/drawing/2016/5/14/chartex" xmlns:mc="http://schemas.openxmlformats.org/markup-compatibility/2006" xmlns:aink="http://schemas.microsoft.com/office/drawing/2016/ink" xmlns:am3d="http://schemas.microsoft.com/office/drawing/2017/model3d" xmlns:o="urn:schemas-microsoft-com:office:office" xmlns:oel="http://schemas.microsoft.com/office/2019/extlst" xmlns:r="http://schemas.openxmlformats.org/officeDocument/2006/relationships" xmlns:m="http://schemas.openxmlformats.org/officeDocument/2006/math" xmlns:v="urn:schemas-microsoft-com:vml" xmlns:wp14="http://schemas.microsoft.com/office/word/2010/wordprocessingDrawing" xmlns:wp="http://schemas.openxmlformats.org/drawingml/2006/wordprocessingDrawing" xmlns:w10="urn:schemas-microsoft-com:office:word" xmlns:w="http://schemas.openxmlformats.org/wordprocessingml/2006/main" xmlns:w14="http://schemas.microsoft.com/office/word/2010/wordml" xmlns:w15="http://schemas.microsoft.com/office/word/2012/wordml" xmlns:w16cex="http://schemas.microsoft.com/office/word/2018/wordml/cex" xmlns:w16cid="http://schemas.microsoft.com/office/word/2016/wordml/cid" xmlns:w16="http://schemas.microsoft.com/office/word/2018/wordml" xmlns:w16du="http://schemas.microsoft.com/office/word/2023/wordml/word16du" xmlns:w16sdtdh="http://schemas.microsoft.com/office/word/2020/wordml/sdtdatahash" xmlns:w16sdtfl="http://schemas.microsoft.com/office/word/2024/wordml/sdtformatlock" xmlns:w16se="http://schemas.microsoft.com/office/word/2015/wordml/symex" xmlns:wpg="http://schemas.microsoft.com/office/word/2010/wordprocessingGroup" xmlns:wpi="http://schemas.microsoft.com/office/word/2010/wordprocessingInk" xmlns:wne="http://schemas.microsoft.com/office/word/2006/wordml" xmlns:wps="http://schemas.microsoft.com/office/word/2010/wordprocessingShape" mc:Ignorable="w14 w15 w16se w16cid w16 w16cex w16sdtdh w16sdtfl w16du wp14">
   <w:abstractNum w:abstractNumId="0" w15:restartNumberingAfterBreak="0">
     <w:nsid w:val="18733680"/>
     <w:multiLevelType w:val="hybridMultilevel"/>
@@ -612,7 +646,7 @@
 </file>
 
 <file path=word/styles.xml><?xml version="1.0" encoding="utf-8"?>
-<w:styles xmlns:mc="http://schemas.openxmlformats.org/markup-compatibility/2006" xmlns:r="http://schemas.openxmlformats.org/officeDocument/2006/relationships" xmlns:w="http://schemas.openxmlformats.org/wordprocessingml/2006/main" xmlns:w14="http://schemas.microsoft.com/office/word/2010/wordml" xmlns:w15="http://schemas.microsoft.com/office/word/2012/wordml" xmlns:w16cex="http://schemas.microsoft.com/office/word/2018/wordml/cex" xmlns:w16cid="http://schemas.microsoft.com/office/word/2016/wordml/cid" xmlns:w16="http://schemas.microsoft.com/office/word/2018/wordml" xmlns:w16sdtdh="http://schemas.microsoft.com/office/word/2020/wordml/sdtdatahash" xmlns:w16se="http://schemas.microsoft.com/office/word/2015/wordml/symex" mc:Ignorable="w14 w15 w16se w16cid w16 w16cex w16sdtdh">
+<w:styles xmlns:mc="http://schemas.openxmlformats.org/markup-compatibility/2006" xmlns:r="http://schemas.openxmlformats.org/officeDocument/2006/relationships" xmlns:w="http://schemas.openxmlformats.org/wordprocessingml/2006/main" xmlns:w14="http://schemas.microsoft.com/office/word/2010/wordml" xmlns:w15="http://schemas.microsoft.com/office/word/2012/wordml" xmlns:w16cex="http://schemas.microsoft.com/office/word/2018/wordml/cex" xmlns:w16cid="http://schemas.microsoft.com/office/word/2016/wordml/cid" xmlns:w16="http://schemas.microsoft.com/office/word/2018/wordml" xmlns:w16du="http://schemas.microsoft.com/office/word/2023/wordml/word16du" xmlns:w16sdtdh="http://schemas.microsoft.com/office/word/2020/wordml/sdtdatahash" xmlns:w16sdtfl="http://schemas.microsoft.com/office/word/2024/wordml/sdtformatlock" xmlns:w16se="http://schemas.microsoft.com/office/word/2015/wordml/symex" mc:Ignorable="w14 w15 w16se w16cid w16 w16cex w16sdtdh w16sdtfl w16du">
   <w:docDefaults>
     <w:rPrDefault>
       <w:rPr>

</xml_diff>